<commit_message>
Correct copy template: cap testimonials at 3 (matches real import limit), clarify closing button is unused
</commit_message>
<xml_diff>
--- a/public/downloads/Spec_Manifest_Copy_Template.docx
+++ b/public/downloads/Spec_Manifest_Copy_Template.docx
@@ -871,7 +871,7 @@
                 <w:sz w:val="18"/>
                 <w:szCs w:val="18"/>
               </w:rPr>
-              <w:t xml:space="preserve">Quote 1-4</w:t>
+              <w:t xml:space="preserve">Quote 1-3</w:t>
             </w:r>
           </w:p>
         </w:tc>
@@ -1782,7 +1782,7 @@
                 <w:sz w:val="18"/>
                 <w:szCs w:val="18"/>
               </w:rPr>
-              <w:t xml:space="preserve">Label + where it goes.</w:t>
+              <w:t xml:space="preserve">Not currently used — this section always reuses the two hero buttons above. Leave blank.</w:t>
             </w:r>
           </w:p>
         </w:tc>

</xml_diff>